<commit_message>
Final commit after changes
</commit_message>
<xml_diff>
--- a/Assignment 4 report.docx
+++ b/Assignment 4 report.docx
@@ -367,7 +367,19 @@
         <w:rPr>
           <w:rFonts w:ascii="Times New Roman" w:hAnsi="Times New Roman" w:cs="Times New Roman"/>
         </w:rPr>
-        <w:t>Code and replication package: [Insert GitHub repository link here]</w:t>
+        <w:t>Code and replication package</w:t>
+      </w:r>
+      <w:r>
+        <w:rPr>
+          <w:rFonts w:ascii="Times New Roman" w:hAnsi="Times New Roman" w:cs="Times New Roman"/>
+        </w:rPr>
+        <w:t xml:space="preserve">: </w:t>
+      </w:r>
+      <w:r>
+        <w:rPr>
+          <w:rFonts w:ascii="Times New Roman" w:hAnsi="Times New Roman" w:cs="Times New Roman"/>
+        </w:rPr>
+        <w:t>https://github.com/TishaRadia/Transport-Analysis</w:t>
       </w:r>
     </w:p>
     <w:p>
@@ -984,14 +996,7 @@
           <w:rFonts w:ascii="Times New Roman" w:hAnsi="Times New Roman" w:cs="Times New Roman"/>
           <w:lang w:val="en-IN"/>
         </w:rPr>
-        <w:t>R</w:t>
-      </w:r>
-      <w:r>
-        <w:rPr>
-          <w:rFonts w:ascii="Times New Roman" w:hAnsi="Times New Roman" w:cs="Times New Roman"/>
-          <w:lang w:val="en-IN"/>
-        </w:rPr>
-        <w:t>ecognising modal and temporal trends in various modes of transportation.</w:t>
+        <w:t>Recognising modal and temporal trends in various modes of transportation.</w:t>
       </w:r>
     </w:p>
     <w:p>
@@ -1011,14 +1016,7 @@
           <w:rFonts w:ascii="Times New Roman" w:hAnsi="Times New Roman" w:cs="Times New Roman"/>
           <w:lang w:val="en-IN"/>
         </w:rPr>
-        <w:t>E</w:t>
-      </w:r>
-      <w:r>
-        <w:rPr>
-          <w:rFonts w:ascii="Times New Roman" w:hAnsi="Times New Roman" w:cs="Times New Roman"/>
-          <w:lang w:val="en-IN"/>
-        </w:rPr>
-        <w:t>valuating the relationships between ridership levels, seasonal events, and climate conditions.</w:t>
+        <w:t>Evaluating the relationships between ridership levels, seasonal events, and climate conditions.</w:t>
       </w:r>
     </w:p>
     <w:p>
@@ -1038,14 +1036,7 @@
           <w:rFonts w:ascii="Times New Roman" w:hAnsi="Times New Roman" w:cs="Times New Roman"/>
           <w:lang w:val="en-IN"/>
         </w:rPr>
-        <w:t>A</w:t>
-      </w:r>
-      <w:r>
-        <w:rPr>
-          <w:rFonts w:ascii="Times New Roman" w:hAnsi="Times New Roman" w:cs="Times New Roman"/>
-          <w:lang w:val="en-IN"/>
-        </w:rPr>
-        <w:t>ssessing system performance with performance metrics like variance across service types, peak-to-average load ratios, and mean ridership deviation</w:t>
+        <w:t>Assessing system performance with performance metrics like variance across service types, peak-to-average load ratios, and mean ridership deviation</w:t>
       </w:r>
       <w:r>
         <w:t xml:space="preserve"> </w:t>
@@ -2171,7 +2162,31 @@
           <w:rFonts w:ascii="Times New Roman" w:hAnsi="Times New Roman" w:cs="Times New Roman"/>
         </w:rPr>
         <w:lastRenderedPageBreak/>
-        <w:t>GitHub Repository. (2025). Replication package for Big Data Transport Analysis. Available at: [Insert GitHub link] [Accessed 17 Aug 2025].</w:t>
+        <w:t xml:space="preserve">GitHub Repository. (2025). Replication package for Big Data Transport Analysis. Available at: </w:t>
+      </w:r>
+      <w:r>
+        <w:rPr>
+          <w:rFonts w:ascii="Times New Roman" w:hAnsi="Times New Roman" w:cs="Times New Roman"/>
+        </w:rPr>
+        <w:t>https://github.com/TishaRadia/Transport-Analysis</w:t>
+      </w:r>
+      <w:r>
+        <w:rPr>
+          <w:rFonts w:ascii="Times New Roman" w:hAnsi="Times New Roman" w:cs="Times New Roman"/>
+        </w:rPr>
+        <w:t xml:space="preserve"> </w:t>
+      </w:r>
+      <w:r>
+        <w:rPr>
+          <w:rFonts w:ascii="Times New Roman" w:hAnsi="Times New Roman" w:cs="Times New Roman"/>
+        </w:rPr>
+        <w:t xml:space="preserve"> </w:t>
+      </w:r>
+      <w:r>
+        <w:rPr>
+          <w:rFonts w:ascii="Times New Roman" w:hAnsi="Times New Roman" w:cs="Times New Roman"/>
+        </w:rPr>
+        <w:t>[Accessed 17 Aug 2025].</w:t>
       </w:r>
     </w:p>
     <w:sectPr>
@@ -3425,6 +3440,7 @@
   <w:style w:type="character" w:default="1" w:styleId="DefaultParagraphFont">
     <w:name w:val="Default Paragraph Font"/>
     <w:uiPriority w:val="1"/>
+    <w:semiHidden/>
     <w:unhideWhenUsed/>
   </w:style>
   <w:style w:type="table" w:default="1" w:styleId="TableNormal">

</xml_diff>